<commit_message>
Adding supporting screenshots word document
</commit_message>
<xml_diff>
--- a/Supporting Screenshots Showing PR and Training/Supporting Screenshots.docx
+++ b/Supporting Screenshots Showing PR and Training/Supporting Screenshots.docx
@@ -4,6 +4,9 @@
   <w:body>
     <w:p>
       <w:r>
+        <w:rPr>
+          <w:noProof/>
+        </w:rPr>
         <w:drawing>
           <wp:inline distT="0" distB="0" distL="0" distR="0" wp14:anchorId="2C34E59D" wp14:editId="53B2BEB2">
             <wp:extent cx="5943600" cy="3432175"/>
@@ -41,8 +44,12 @@
         </w:drawing>
       </w:r>
     </w:p>
+    <w:p/>
     <w:p>
       <w:r>
+        <w:rPr>
+          <w:noProof/>
+        </w:rPr>
         <w:drawing>
           <wp:inline distT="0" distB="0" distL="0" distR="0" wp14:anchorId="3B7A0599" wp14:editId="2C4D77BF">
             <wp:extent cx="5943600" cy="3572510"/>
@@ -82,6 +89,9 @@
     </w:p>
     <w:p>
       <w:r>
+        <w:rPr>
+          <w:noProof/>
+        </w:rPr>
         <w:lastRenderedPageBreak/>
         <w:drawing>
           <wp:inline distT="0" distB="0" distL="0" distR="0" wp14:anchorId="1523C006" wp14:editId="21F5D40E">
@@ -122,6 +132,9 @@
     </w:p>
     <w:p>
       <w:r>
+        <w:rPr>
+          <w:noProof/>
+        </w:rPr>
         <w:drawing>
           <wp:inline distT="0" distB="0" distL="0" distR="0" wp14:anchorId="664ACD11" wp14:editId="6FC1CA2A">
             <wp:extent cx="5943600" cy="2978785"/>
@@ -161,6 +174,9 @@
     </w:p>
     <w:p>
       <w:r>
+        <w:rPr>
+          <w:noProof/>
+        </w:rPr>
         <w:lastRenderedPageBreak/>
         <w:drawing>
           <wp:inline distT="0" distB="0" distL="0" distR="0" wp14:anchorId="623F3A51" wp14:editId="16F02EAA">
@@ -207,6 +223,9 @@
     <w:p/>
     <w:p>
       <w:r>
+        <w:rPr>
+          <w:noProof/>
+        </w:rPr>
         <w:drawing>
           <wp:inline distT="0" distB="0" distL="0" distR="0" wp14:anchorId="07082685" wp14:editId="441DB558">
             <wp:extent cx="5943600" cy="193040"/>
@@ -247,6 +266,9 @@
     <w:p/>
     <w:p>
       <w:r>
+        <w:rPr>
+          <w:noProof/>
+        </w:rPr>
         <w:drawing>
           <wp:inline distT="0" distB="0" distL="0" distR="0" wp14:anchorId="111BDF8D" wp14:editId="2AE807D4">
             <wp:extent cx="5943600" cy="568325"/>
@@ -287,6 +309,9 @@
     <w:p/>
     <w:p>
       <w:r>
+        <w:rPr>
+          <w:noProof/>
+        </w:rPr>
         <w:drawing>
           <wp:inline distT="0" distB="0" distL="0" distR="0" wp14:anchorId="2F2E963A" wp14:editId="27986E81">
             <wp:extent cx="5943600" cy="450850"/>

</xml_diff>